<commit_message>
Auto-save: 82 file(s) — 2026-08-25 14:06
</commit_message>
<xml_diff>
--- a/Projects/NEPRA Follow-Up Letters/08_Atlas_Power.docx
+++ b/Projects/NEPRA Follow-Up Letters/08_Atlas_Power.docx
@@ -21,7 +21,7 @@
           <w:sz w:val="19"/>
           <w:szCs w:val="19"/>
         </w:rPr>
-        <w:t>{{ADDR1}}</w:t>
+        <w:t>The Chief Executive Officer</w:t>
       </w:r>
     </w:p>
     <w:p>
@@ -39,7 +39,7 @@
           <w:sz w:val="19"/>
           <w:szCs w:val="19"/>
         </w:rPr>
-        <w:t>{{ADDR2}}</w:t>
+        <w:t>Atlas Power</w:t>
       </w:r>
     </w:p>
     <w:p>
@@ -58,24 +58,7 @@
           <w:sz w:val="19"/>
           <w:szCs w:val="19"/>
         </w:rPr>
-        <w:t>{{ADDR3}}</w:t>
-      </w:r>
-    </w:p>
-    <w:p>
-      <w:pPr>
-        <w:rPr>
-          <w:rFonts w:ascii="Poppins" w:hAnsi="Poppins" w:cs="Poppins"/>
-          <w:sz w:val="19"/>
-          <w:szCs w:val="19"/>
-        </w:rPr>
-      </w:pPr>
-      <w:r>
-        <w:rPr>
-          <w:rFonts w:ascii="Poppins" w:hAnsi="Poppins" w:cs="Poppins"/>
-          <w:sz w:val="19"/>
-          <w:szCs w:val="19"/>
-        </w:rPr>
-        <w:t>{{ADDR4}}</w:t>
+        <w:t>26-27 Km, Lahore-Sheikhupura Road, Sheikhupura</w:t>
       </w:r>
     </w:p>
     <w:p>
@@ -105,7 +88,18 @@
           <w:sz w:val="19"/>
           <w:szCs w:val="19"/>
         </w:rPr>
-        <w:t>Subject: Follow-Up: NEPRA IT/OT Security Compliance Support for {{COMPANY}}</w:t>
+        <w:t xml:space="preserve">Subject: Follow-Up: NEPRA IT/OT Security Compliance Support for </w:t>
+      </w:r>
+      <w:r>
+        <w:rPr>
+          <w:rFonts w:ascii="Poppins" w:eastAsia="Calibri" w:hAnsi="Poppins" w:cs="Poppins"/>
+          <w:b/>
+          <w:bCs/>
+          <w:color w:val="0B2545"/>
+          <w:sz w:val="19"/>
+          <w:szCs w:val="19"/>
+        </w:rPr>
+        <w:t>Atlas Power</w:t>
       </w:r>
     </w:p>
     <w:p>
@@ -126,7 +120,25 @@
           <w:sz w:val="19"/>
           <w:szCs w:val="19"/>
         </w:rPr>
-        <w:t>Dear {{SALUT}},</w:t>
+        <w:t xml:space="preserve">Dear </w:t>
+      </w:r>
+      <w:r>
+        <w:rPr>
+          <w:rFonts w:ascii="Poppins" w:eastAsia="Calibri" w:hAnsi="Poppins" w:cs="Poppins"/>
+          <w:color w:val="3A3A3A"/>
+          <w:sz w:val="19"/>
+          <w:szCs w:val="19"/>
+        </w:rPr>
+        <w:t>Sir/Madam</w:t>
+      </w:r>
+      <w:r>
+        <w:rPr>
+          <w:rFonts w:ascii="Poppins" w:eastAsia="Calibri" w:hAnsi="Poppins" w:cs="Poppins"/>
+          <w:color w:val="3A3A3A"/>
+          <w:sz w:val="19"/>
+          <w:szCs w:val="19"/>
+        </w:rPr>
+        <w:t>,</w:t>
       </w:r>
     </w:p>
     <w:p>
@@ -145,7 +157,23 @@
           <w:sz w:val="19"/>
           <w:szCs w:val="19"/>
         </w:rPr>
-        <w:t>I’m following up on our earlier note regarding NEPRA’s Security of IT and OT Regulations, 2022. As specialists in NEPRA compliance, we’d welcome the opportunity to support {{COMPANY}} in meeting these requirements.</w:t>
+        <w:t xml:space="preserve">I’m following up on our earlier note regarding NEPRA’s Security of IT and OT Regulations, 2022. As specialists in NEPRA compliance, we’d welcome the opportunity to support </w:t>
+      </w:r>
+      <w:r>
+        <w:rPr>
+          <w:rFonts w:ascii="Poppins" w:hAnsi="Poppins" w:cs="Poppins"/>
+          <w:sz w:val="19"/>
+          <w:szCs w:val="19"/>
+        </w:rPr>
+        <w:t>Atlas Power</w:t>
+      </w:r>
+      <w:r>
+        <w:rPr>
+          <w:rFonts w:ascii="Poppins" w:hAnsi="Poppins" w:cs="Poppins"/>
+          <w:sz w:val="19"/>
+          <w:szCs w:val="19"/>
+        </w:rPr>
+        <w:t xml:space="preserve"> in meeting these requirements.</w:t>
       </w:r>
     </w:p>
     <w:p>
@@ -352,7 +380,25 @@
           <w:sz w:val="19"/>
           <w:szCs w:val="19"/>
         </w:rPr>
-        <w:t>We look forward to supporting {{COMPANY}} in strengthening cyber resilience and achieving full alignment with NEPRA’s regulatory requirements.</w:t>
+        <w:t xml:space="preserve">We look forward to supporting </w:t>
+      </w:r>
+      <w:r>
+        <w:rPr>
+          <w:rFonts w:ascii="Poppins" w:eastAsia="Calibri" w:hAnsi="Poppins" w:cs="Poppins"/>
+          <w:color w:val="3A3A3A"/>
+          <w:sz w:val="19"/>
+          <w:szCs w:val="19"/>
+        </w:rPr>
+        <w:t>Atlas Power</w:t>
+      </w:r>
+      <w:r>
+        <w:rPr>
+          <w:rFonts w:ascii="Poppins" w:eastAsia="Calibri" w:hAnsi="Poppins" w:cs="Poppins"/>
+          <w:color w:val="3A3A3A"/>
+          <w:sz w:val="19"/>
+          <w:szCs w:val="19"/>
+        </w:rPr>
+        <w:t xml:space="preserve"> in strengthening cyber resilience and achieving full alignment with NEPRA’s regulatory requirements.</w:t>
       </w:r>
     </w:p>
     <w:p>
@@ -559,7 +605,6 @@
           <w:sz w:val="19"/>
           <w:szCs w:val="19"/>
         </w:rPr>
-        <w:lastRenderedPageBreak/>
         <w:t>Email: xsecurity@xloopdigital.com</w:t>
       </w:r>
     </w:p>

</xml_diff>

<commit_message>
Auto-save: 81 file(s) — 2026-08-25 15:30
</commit_message>
<xml_diff>
--- a/Projects/NEPRA Follow-Up Letters/08_Atlas_Power.docx
+++ b/Projects/NEPRA Follow-Up Letters/08_Atlas_Power.docx
@@ -94,7 +94,6 @@
     <w:p>
       <w:pPr>
         <w:spacing w:after="130" w:line="276" w:lineRule="auto"/>
-        <w:jc w:val="both"/>
         <w:rPr>
           <w:rFonts w:ascii="Poppins" w:eastAsia="Calibri" w:hAnsi="Poppins" w:cs="Poppins"/>
           <w:color w:val="3A3A3A"/>
@@ -133,7 +132,6 @@
     <w:p>
       <w:pPr>
         <w:spacing w:after="130" w:line="276" w:lineRule="auto"/>
-        <w:jc w:val="both"/>
         <w:rPr>
           <w:rFonts w:ascii="Poppins" w:hAnsi="Poppins" w:cs="Poppins"/>
           <w:sz w:val="19"/>
@@ -350,7 +348,6 @@
     <w:p>
       <w:pPr>
         <w:spacing w:after="130" w:line="276" w:lineRule="auto"/>
-        <w:jc w:val="both"/>
         <w:rPr>
           <w:rFonts w:ascii="Poppins" w:hAnsi="Poppins" w:cs="Poppins"/>
           <w:sz w:val="19"/>
@@ -373,61 +370,61 @@
           <w:sz w:val="19"/>
           <w:szCs w:val="19"/>
         </w:rPr>
-        <w:t>at https://www.xloopdigital.com/services/cyber-security-service</w:t>
-      </w:r>
-      <w:r>
+        <w:t xml:space="preserve">at </w:t>
+      </w:r>
+      <w:hyperlink r:id="rId7" w:history="1">
+        <w:r>
+          <w:rPr>
+            <w:rStyle w:val="Hyperlink"/>
+            <w:rFonts w:ascii="Poppins" w:eastAsia="Calibri" w:hAnsi="Poppins" w:cs="Poppins"/>
+            <w:sz w:val="19"/>
+            <w:szCs w:val="19"/>
+          </w:rPr>
+          <w:t>https://www.xloopdigital.com/services/cyber-security-service</w:t>
+        </w:r>
+      </w:hyperlink>
+    </w:p>
+    <w:p>
+      <w:pPr>
+        <w:spacing w:after="130" w:line="276" w:lineRule="auto"/>
         <w:rPr>
           <w:rFonts w:ascii="Poppins" w:eastAsia="Calibri" w:hAnsi="Poppins" w:cs="Poppins"/>
           <w:color w:val="3A3A3A"/>
           <w:sz w:val="19"/>
           <w:szCs w:val="19"/>
         </w:rPr>
-        <w:t>.</w:t>
+      </w:pPr>
+      <w:r>
+        <w:rPr>
+          <w:rFonts w:ascii="Poppins" w:eastAsia="Calibri" w:hAnsi="Poppins" w:cs="Poppins"/>
+          <w:color w:val="3A3A3A"/>
+          <w:sz w:val="19"/>
+          <w:szCs w:val="19"/>
+        </w:rPr>
+        <w:t xml:space="preserve">We look forward to supporting </w:t>
+      </w:r>
+      <w:r>
+        <w:rPr>
+          <w:rFonts w:ascii="Poppins" w:eastAsia="Calibri" w:hAnsi="Poppins" w:cs="Poppins"/>
+          <w:color w:val="3A3A3A"/>
+          <w:sz w:val="19"/>
+          <w:szCs w:val="19"/>
+        </w:rPr>
+        <w:t>Atlas Power</w:t>
+      </w:r>
+      <w:r>
+        <w:rPr>
+          <w:rFonts w:ascii="Poppins" w:eastAsia="Calibri" w:hAnsi="Poppins" w:cs="Poppins"/>
+          <w:color w:val="3A3A3A"/>
+          <w:sz w:val="19"/>
+          <w:szCs w:val="19"/>
+        </w:rPr>
+        <w:t xml:space="preserve"> in strengthening cyber resilience and achieving full alignment with NEPRA’s regulatory requirements.</w:t>
       </w:r>
     </w:p>
     <w:p>
       <w:pPr>
         <w:spacing w:after="130" w:line="276" w:lineRule="auto"/>
-        <w:jc w:val="both"/>
-        <w:rPr>
-          <w:rFonts w:ascii="Poppins" w:eastAsia="Calibri" w:hAnsi="Poppins" w:cs="Poppins"/>
-          <w:color w:val="3A3A3A"/>
-          <w:sz w:val="19"/>
-          <w:szCs w:val="19"/>
-        </w:rPr>
-      </w:pPr>
-      <w:r>
-        <w:rPr>
-          <w:rFonts w:ascii="Poppins" w:eastAsia="Calibri" w:hAnsi="Poppins" w:cs="Poppins"/>
-          <w:color w:val="3A3A3A"/>
-          <w:sz w:val="19"/>
-          <w:szCs w:val="19"/>
-        </w:rPr>
-        <w:t xml:space="preserve">We look forward to supporting </w:t>
-      </w:r>
-      <w:r>
-        <w:rPr>
-          <w:rFonts w:ascii="Poppins" w:eastAsia="Calibri" w:hAnsi="Poppins" w:cs="Poppins"/>
-          <w:color w:val="3A3A3A"/>
-          <w:sz w:val="19"/>
-          <w:szCs w:val="19"/>
-        </w:rPr>
-        <w:t>Atlas Power</w:t>
-      </w:r>
-      <w:r>
-        <w:rPr>
-          <w:rFonts w:ascii="Poppins" w:eastAsia="Calibri" w:hAnsi="Poppins" w:cs="Poppins"/>
-          <w:color w:val="3A3A3A"/>
-          <w:sz w:val="19"/>
-          <w:szCs w:val="19"/>
-        </w:rPr>
-        <w:t xml:space="preserve"> in strengthening cyber resilience and achieving full alignment with NEPRA’s regulatory requirements.</w:t>
-      </w:r>
-    </w:p>
-    <w:p>
-      <w:pPr>
-        <w:spacing w:after="130" w:line="276" w:lineRule="auto"/>
-        <w:jc w:val="both"/>
         <w:rPr>
           <w:rFonts w:ascii="Poppins" w:hAnsi="Poppins" w:cs="Poppins"/>
           <w:sz w:val="19"/>
@@ -659,8 +656,8 @@
       </w:pPr>
     </w:p>
     <w:sectPr>
-      <w:headerReference w:type="default" r:id="rId7"/>
-      <w:footerReference w:type="default" r:id="rId8"/>
+      <w:headerReference w:type="default" r:id="rId8"/>
+      <w:footerReference w:type="default" r:id="rId9"/>
       <w:pgSz w:w="12240" w:h="15840"/>
       <w:pgMar w:top="2160" w:right="1100" w:bottom="900" w:left="1100" w:header="708" w:footer="708" w:gutter="0"/>
       <w:cols w:space="720"/>
@@ -1783,6 +1780,18 @@
     <w:uiPriority w:val="99"/>
     <w:rsid w:val="00D51F52"/>
   </w:style>
+  <w:style w:type="character" w:styleId="UnresolvedMention">
+    <w:name w:val="Unresolved Mention"/>
+    <w:basedOn w:val="DefaultParagraphFont"/>
+    <w:uiPriority w:val="99"/>
+    <w:semiHidden/>
+    <w:unhideWhenUsed/>
+    <w:rsid w:val="00F02C52"/>
+    <w:rPr>
+      <w:color w:val="605E5C"/>
+      <w:shd w:val="clear" w:color="auto" w:fill="E1DFDD"/>
+    </w:rPr>
+  </w:style>
 </w:styles>
 </file>
 

</xml_diff>